<commit_message>
TE5: audit fixes (new Swing triangle, to-scale figures, angle/side speech, captions, distractors), audit notes, README row
Co-Authored-By: Claude Opus 5.5 <noreply@anthropic.com>
Claude-Session: https://claude.ai/code/session_013Y8PfETWcMLvmUEpCdE8Wq
</commit_message>
<xml_diff>
--- a/support-materials/TE5/TE5_worked_examples.docx
+++ b/support-materials/TE5/TE5_worked_examples.docx
@@ -111,7 +111,7 @@
           <wp:inline distT="0" distB="0" distL="0" distR="0">
             <wp:extent cx="4410075" cy="2476500"/>
             <wp:effectExtent t="0" r="0" b="0" l="0"/>
-            <wp:docPr id="1" name="wl1" descr="A triangle marked with three side lengths. Plotted data: Triangle ABC, not drawn to scale, with A at the bottom left, B at the bottom right, and C at the top. Side c, the bottom side from A to B, is marked 12. Side b, from A to C, is marked 9. Side a, from B to C, is marked 7. No angles are marked." title="A triangle marked with three side lengths"/>
+            <wp:docPr id="1" name="wl1" descr="A triangle marked with three side lengths. Plotted data: Triangle ABC, drawn to scale, with A at the bottom left, B at the bottom right, and C at the top. Side c, the bottom side from A to B, is marked 12. Side b, from A to C, is marked 9. Side a, from B to C, is marked 7. No angles are marked." title="A triangle marked with three side lengths"/>
             <wp:cNvGraphicFramePr>
               <a:graphicFrameLocks xmlns:a="http://schemas.openxmlformats.org/drawingml/2006/main" noChangeAspect="1"/>
             </wp:cNvGraphicFramePr>
@@ -165,7 +165,7 @@
           <w:sz w:val="22"/>
           <w:szCs w:val="22"/>
         </w:rPr>
-        <w:t xml:space="preserve">Triangle ABC, not drawn to scale, with A at the bottom left, B at the bottom right, and C at the top. Side c, the bottom side from A to B, is marked 12. Side b, from A to C, is marked 9. Side a, from B to C, is marked 7. No angles are marked.</w:t>
+        <w:t xml:space="preserve">Triangle ABC, drawn to scale, with A at the bottom left, B at the bottom right, and C at the top. Side c, the bottom side from A to B, is marked 12. Side b, from A to C, is marked 9. Side a, from B to C, is marked 7. No angles are marked.</w:t>
       </w:r>
     </w:p>
     <w:p>
@@ -306,7 +306,7 @@
           <wp:inline distT="0" distB="0" distL="0" distR="0">
             <wp:extent cx="4429125" cy="2476500"/>
             <wp:effectExtent t="0" r="0" b="0" l="0"/>
-            <wp:docPr id="1" name="wl2" descr="A triangle marked with two angles and one side. Plotted data: Triangle ABC, not drawn to scale, with A at the bottom left, B at the bottom right, and C at the top. Angle A is marked 40°. Angle B is marked 65°. Side a, from B to C, is marked 10. Sides b and c are not marked." title="A triangle marked with two angles and one side"/>
+            <wp:docPr id="1" name="wl2" descr="A triangle marked with two angles and one side. Plotted data: Triangle ABC, drawn to scale, with A at the bottom left, B at the bottom right, and C at the top. Angle A is marked 40°. Angle B is marked 65°. Side a, from B to C, is marked 10. Sides b and c are labeled with letters only, with no lengths given." title="A triangle marked with two angles and one side"/>
             <wp:cNvGraphicFramePr>
               <a:graphicFrameLocks xmlns:a="http://schemas.openxmlformats.org/drawingml/2006/main" noChangeAspect="1"/>
             </wp:cNvGraphicFramePr>
@@ -360,7 +360,7 @@
           <w:sz w:val="22"/>
           <w:szCs w:val="22"/>
         </w:rPr>
-        <w:t xml:space="preserve">Triangle ABC, not drawn to scale, with A at the bottom left, B at the bottom right, and C at the top. Angle A is marked 40°. Angle B is marked 65°. Side a, from B to C, is marked 10. Sides b and c are not marked.</w:t>
+        <w:t xml:space="preserve">Triangle ABC, drawn to scale, with A at the bottom left, B at the bottom right, and C at the top. Angle A is marked 40°. Angle B is marked 65°. Side a, from B to C, is marked 10. Sides b and c are labeled with letters only, with no lengths given.</w:t>
       </w:r>
     </w:p>
     <w:p>
@@ -607,7 +607,7 @@
           <wp:inline distT="0" distB="0" distL="0" distR="0">
             <wp:extent cx="4429125" cy="2476500"/>
             <wp:effectExtent t="0" r="0" b="0" l="0"/>
-            <wp:docPr id="1" name="wl3" descr="A triangle marked with two sides and one angle. Plotted data: Triangle ABC, not drawn to scale, with A at the bottom left, B at the bottom right, and C at the top. Angle B, at the bottom right corner, is marked 50°. Side c, the bottom side from A to B, is marked 11. Side a, from B to C, is marked 8. Side b and angles A and C are not marked." title="A triangle marked with two sides and one angle"/>
+            <wp:docPr id="1" name="wl3" descr="A triangle marked with two sides and one angle. Plotted data: Triangle ABC, drawn to scale, with A at the bottom left, B at the bottom right, and C at the top. Angle B, at the bottom right corner, is marked 50°. Side c, the bottom side from A to B, is marked 11. Side a, from B to C, is marked 8. Side b is labeled with a letter only, and angles A and C are not marked." title="A triangle marked with two sides and one angle"/>
             <wp:cNvGraphicFramePr>
               <a:graphicFrameLocks xmlns:a="http://schemas.openxmlformats.org/drawingml/2006/main" noChangeAspect="1"/>
             </wp:cNvGraphicFramePr>
@@ -661,7 +661,7 @@
           <w:sz w:val="22"/>
           <w:szCs w:val="22"/>
         </w:rPr>
-        <w:t xml:space="preserve">Triangle ABC, not drawn to scale, with A at the bottom left, B at the bottom right, and C at the top. Angle B, at the bottom right corner, is marked 50°. Side c, the bottom side from A to B, is marked 11. Side a, from B to C, is marked 8. Side b and angles A and C are not marked.</w:t>
+        <w:t xml:space="preserve">Triangle ABC, drawn to scale, with A at the bottom left, B at the bottom right, and C at the top. Angle B, at the bottom right corner, is marked 50°. Side c, the bottom side from A to B, is marked 11. Side a, from B to C, is marked 8. Side b is labeled with a letter only, and angles A and C are not marked.</w:t>
       </w:r>
     </w:p>
     <w:p>
@@ -907,7 +907,7 @@
           <wp:inline distT="0" distB="0" distL="0" distR="0">
             <wp:extent cx="4410075" cy="2476500"/>
             <wp:effectExtent t="0" r="0" b="0" l="0"/>
-            <wp:docPr id="1" name="wl4" descr="A triangle marked with two angles and the side joining them. Plotted data: Triangle ABC, not drawn to scale, with A at the bottom left, B at the bottom right, and C at the top. Angle A is marked 35°. Angle B is marked 80°. Side c, the bottom side from A to B, is marked 14. Sides a and b and angle C are not marked." title="A triangle marked with two angles and the side joining them"/>
+            <wp:docPr id="1" name="wl4" descr="A triangle marked with two angles and the side joining them. Plotted data: Triangle ABC, drawn to scale, with A at the bottom left, B at the bottom right, and C at the top. Angle A is marked 35°. Angle B is marked 80°. Side c, the bottom side from A to B, is marked 14. Sides a and b are labeled with letters only, and angle C is not marked." title="A triangle marked with two angles and the side joining them"/>
             <wp:cNvGraphicFramePr>
               <a:graphicFrameLocks xmlns:a="http://schemas.openxmlformats.org/drawingml/2006/main" noChangeAspect="1"/>
             </wp:cNvGraphicFramePr>
@@ -961,7 +961,7 @@
           <w:sz w:val="22"/>
           <w:szCs w:val="22"/>
         </w:rPr>
-        <w:t xml:space="preserve">Triangle ABC, not drawn to scale, with A at the bottom left, B at the bottom right, and C at the top. Angle A is marked 35°. Angle B is marked 80°. Side c, the bottom side from A to B, is marked 14. Sides a and b and angle C are not marked.</w:t>
+        <w:t xml:space="preserve">Triangle ABC, drawn to scale, with A at the bottom left, B at the bottom right, and C at the top. Angle A is marked 35°. Angle B is marked 80°. Side c, the bottom side from A to B, is marked 14. Sides a and b are labeled with letters only, and angle C is not marked.</w:t>
       </w:r>
     </w:p>
     <w:p>
@@ -1267,7 +1267,7 @@
           <wp:inline distT="0" distB="0" distL="0" distR="0">
             <wp:extent cx="4429125" cy="2476500"/>
             <wp:effectExtent t="0" r="0" b="0" l="0"/>
-            <wp:docPr id="1" name="lc1" descr="A triangle marked with two sides, the angle where they meet, and an unknown side. Plotted data: Triangle ABC, not drawn to scale, with A at the bottom left, B at the bottom right, and C at the top. Angle C, at the top, is marked 50°. Side b, from A to C, is marked 11. Side a, from B to C, is marked 8. Side c, the bottom side, is marked with a question mark." title="A triangle marked with two sides, the angle where they meet, and an unknown side"/>
+            <wp:docPr id="1" name="lc1" descr="A triangle marked with two sides, the angle where they meet, and an unknown side. Plotted data: Triangle ABC, drawn to scale, with A at the bottom left, B at the bottom right, and C at the top. Angle C, at the top, is marked 50°. Side b, from A to C, is marked 11. Side a, from B to C, is marked 8. Side c, the bottom side, is marked with a question mark." title="A triangle marked with two sides, the angle where they meet, and an unknown side"/>
             <wp:cNvGraphicFramePr>
               <a:graphicFrameLocks xmlns:a="http://schemas.openxmlformats.org/drawingml/2006/main" noChangeAspect="1"/>
             </wp:cNvGraphicFramePr>
@@ -1321,7 +1321,7 @@
           <w:sz w:val="22"/>
           <w:szCs w:val="22"/>
         </w:rPr>
-        <w:t xml:space="preserve">Triangle ABC, not drawn to scale, with A at the bottom left, B at the bottom right, and C at the top. Angle C, at the top, is marked 50°. Side b, from A to C, is marked 11. Side a, from B to C, is marked 8. Side c, the bottom side, is marked with a question mark.</w:t>
+        <w:t xml:space="preserve">Triangle ABC, drawn to scale, with A at the bottom left, B at the bottom right, and C at the top. Angle C, at the top, is marked 50°. Side b, from A to C, is marked 11. Side a, from B to C, is marked 8. Side c, the bottom side, is marked with a question mark.</w:t>
       </w:r>
     </w:p>
     <w:p>
@@ -1588,7 +1588,7 @@
           <wp:inline distT="0" distB="0" distL="0" distR="0">
             <wp:extent cx="4429125" cy="2476500"/>
             <wp:effectExtent t="0" r="0" b="0" l="0"/>
-            <wp:docPr id="1" name="lc2" descr="A triangle marked with three sides and an unknown angle at the top. Plotted data: Triangle ABC, not drawn to scale, with A at the bottom left, B at the bottom right, and C at the top. Side c, the bottom side, is marked 12. Side b, from A to C, is marked 9. Side a, from B to C, is marked 7. Angle C, at the top, is marked with a question mark." title="A triangle marked with three sides and an unknown angle at the top"/>
+            <wp:docPr id="1" name="lc2" descr="A triangle marked with three sides and an unknown angle at the top. Plotted data: Triangle ABC, drawn to scale, with A at the bottom left, B at the bottom right, and C at the top. Side c, the bottom side, is marked 12. Side b, from A to C, is marked 9. Side a, from B to C, is marked 7. Angle C, at the top, is marked with a question mark." title="A triangle marked with three sides and an unknown angle at the top"/>
             <wp:cNvGraphicFramePr>
               <a:graphicFrameLocks xmlns:a="http://schemas.openxmlformats.org/drawingml/2006/main" noChangeAspect="1"/>
             </wp:cNvGraphicFramePr>
@@ -1642,7 +1642,7 @@
           <w:sz w:val="22"/>
           <w:szCs w:val="22"/>
         </w:rPr>
-        <w:t xml:space="preserve">Triangle ABC, not drawn to scale, with A at the bottom left, B at the bottom right, and C at the top. Side c, the bottom side, is marked 12. Side b, from A to C, is marked 9. Side a, from B to C, is marked 7. Angle C, at the top, is marked with a question mark.</w:t>
+        <w:t xml:space="preserve">Triangle ABC, drawn to scale, with A at the bottom left, B at the bottom right, and C at the top. Side c, the bottom side, is marked 12. Side b, from A to C, is marked 9. Side a, from B to C, is marked 7. Angle C, at the top, is marked with a question mark.</w:t>
       </w:r>
     </w:p>
     <w:p>
@@ -1866,7 +1866,7 @@
         <w:t xml:space="preserve">C</w:t>
       </w:r>
       <w:r>
-        <w:t xml:space="preserve"> is obtuse, which makes sense: it is across from the longest side. The answer 83.6 drops the negative sign, and 48.2 puts the sides in the wrong places. </w:t>
+        <w:t xml:space="preserve"> is obtuse, which makes sense: it is across from the longest side. The answer 83.6 drops the negative sign, and 48.2° is angle B. </w:t>
       </w:r>
       <w:r>
         <w:rPr>
@@ -1913,7 +1913,7 @@
           <wp:inline distT="0" distB="0" distL="0" distR="0">
             <wp:extent cx="4429125" cy="2476500"/>
             <wp:effectExtent t="0" r="0" b="0" l="0"/>
-            <wp:docPr id="1" name="lc3" descr="A triangle with a wide angle at A, two marked sides, and an unknown side. Plotted data: Triangle ABC, not drawn to scale. A is at the bottom middle, B at the bottom right, and C at the upper left, so the angle at A opens wide. Angle A is marked 110°. Side c, from A to B along the bottom, is marked 9. Side b, from A up to C, is marked 5. Side a, the long side from B to C, is marked with a question mark." title="A triangle with a wide angle at A, two marked sides, and an unknown side"/>
+            <wp:docPr id="1" name="lc3" descr="A triangle marked with angle A, two sides, and an unknown side. Plotted data: Triangle ABC, drawn to scale. A is near the bottom left, B is at the bottom right, and C is above and to the left of A. Angle A is marked 110°. Side c, from A to B along the bottom, is marked 9. Side b, from A up to C, is marked 5. Side a, the long side from B to C, is marked with a question mark." title="A triangle marked with angle A, two sides, and an unknown side"/>
             <wp:cNvGraphicFramePr>
               <a:graphicFrameLocks xmlns:a="http://schemas.openxmlformats.org/drawingml/2006/main" noChangeAspect="1"/>
             </wp:cNvGraphicFramePr>
@@ -1967,7 +1967,7 @@
           <w:sz w:val="22"/>
           <w:szCs w:val="22"/>
         </w:rPr>
-        <w:t xml:space="preserve">Triangle ABC, not drawn to scale. A is at the bottom middle, B at the bottom right, and C at the upper left, so the angle at A opens wide. Angle A is marked 110°. Side c, from A to B along the bottom, is marked 9. Side b, from A up to C, is marked 5. Side a, the long side from B to C, is marked with a question mark.</w:t>
+        <w:t xml:space="preserve">Triangle ABC, drawn to scale. A is near the bottom left, B is at the bottom right, and C is above and to the left of A. Angle A is marked 110°. Side c, from A to B along the bottom, is marked 9. Side b, from A up to C, is marked 5. Side a, the long side from B to C, is marked with a question mark.</w:t>
       </w:r>
     </w:p>
     <w:p>
@@ -2270,7 +2270,7 @@
           <wp:inline distT="0" distB="0" distL="0" distR="0">
             <wp:extent cx="4429125" cy="2476500"/>
             <wp:effectExtent t="0" r="0" b="0" l="0"/>
-            <wp:docPr id="1" name="lc4" descr="A triangle marked with three sides and an unknown angle at A. Plotted data: Triangle ABC, not drawn to scale, with A at the bottom left, B at the bottom right, and C at the top. Side c, the bottom side, is marked 10. Side b, from A to C, is marked 8. Side a, from B to C, is marked 5. Angle A is marked with a question mark." title="A triangle marked with three sides and an unknown angle at A"/>
+            <wp:docPr id="1" name="lc4" descr="A triangle marked with three sides and an unknown angle at A. Plotted data: Triangle ABC, drawn to scale, with A at the bottom left, B at the bottom right, and C at the top. Side c, the bottom side, is marked 10. Side b, from A to C, is marked 8. Side a, from B to C, is marked 5. Angle A is marked with a question mark." title="A triangle marked with three sides and an unknown angle at A"/>
             <wp:cNvGraphicFramePr>
               <a:graphicFrameLocks xmlns:a="http://schemas.openxmlformats.org/drawingml/2006/main" noChangeAspect="1"/>
             </wp:cNvGraphicFramePr>
@@ -2324,7 +2324,7 @@
           <w:sz w:val="22"/>
           <w:szCs w:val="22"/>
         </w:rPr>
-        <w:t xml:space="preserve">Triangle ABC, not drawn to scale, with A at the bottom left, B at the bottom right, and C at the top. Side c, the bottom side, is marked 10. Side b, from A to C, is marked 8. Side a, from B to C, is marked 5. Angle A is marked with a question mark.</w:t>
+        <w:t xml:space="preserve">Triangle ABC, drawn to scale, with A at the bottom left, B at the bottom right, and C at the top. Side c, the bottom side, is marked 10. Side b, from A to C, is marked 8. Side a, from B to C, is marked 5. Angle A is marked with a question mark.</w:t>
       </w:r>
     </w:p>
     <w:p>
@@ -2600,7 +2600,7 @@
           <wp:inline distT="0" distB="0" distL="0" distR="0">
             <wp:extent cx="4429125" cy="2476500"/>
             <wp:effectExtent t="0" r="0" b="0" l="0"/>
-            <wp:docPr id="1" name="ls1" descr="A triangle marked with two angles, one side, and an unknown side. Plotted data: Triangle ABC, not drawn to scale, with A at the bottom left, B at the bottom right, and C at the top. Angle A is marked 40°. Angle B is marked 65°. Side a, from B to C, is marked 10. Side b, from A to C, is marked with a question mark." title="A triangle marked with two angles, one side, and an unknown side"/>
+            <wp:docPr id="1" name="ls1" descr="A triangle marked with two angles, one side, and an unknown side. Plotted data: Triangle ABC, drawn to scale, with A at the bottom left, B at the bottom right, and C at the top. Angle A is marked 40°. Angle B is marked 65°. Side a, from B to C, is marked 10. Side b, from A to C, is marked with a question mark. Side c is labeled with a letter only." title="A triangle marked with two angles, one side, and an unknown side"/>
             <wp:cNvGraphicFramePr>
               <a:graphicFrameLocks xmlns:a="http://schemas.openxmlformats.org/drawingml/2006/main" noChangeAspect="1"/>
             </wp:cNvGraphicFramePr>
@@ -2654,7 +2654,7 @@
           <w:sz w:val="22"/>
           <w:szCs w:val="22"/>
         </w:rPr>
-        <w:t xml:space="preserve">Triangle ABC, not drawn to scale, with A at the bottom left, B at the bottom right, and C at the top. Angle A is marked 40°. Angle B is marked 65°. Side a, from B to C, is marked 10. Side b, from A to C, is marked with a question mark.</w:t>
+        <w:t xml:space="preserve">Triangle ABC, drawn to scale, with A at the bottom left, B at the bottom right, and C at the top. Angle A is marked 40°. Angle B is marked 65°. Side a, from B to C, is marked 10. Side b, from A to C, is marked with a question mark. Side c is labeled with a letter only.</w:t>
       </w:r>
     </w:p>
     <w:p>
@@ -3002,7 +3002,7 @@
           <wp:inline distT="0" distB="0" distL="0" distR="0">
             <wp:extent cx="4429125" cy="2476500"/>
             <wp:effectExtent t="0" r="0" b="0" l="0"/>
-            <wp:docPr id="1" name="ls2" descr="A triangle marked with two angles, the side joining them, and an unknown side. Plotted data: Triangle ABC, not drawn to scale, with A at the bottom left, B at the bottom right, and C at the top. Angle A is marked 35°. Angle B is marked 80°. Side c, the bottom side, is marked 14. Side a, from B to C, is marked with a question mark." title="A triangle marked with two angles, the side joining them, and an unknown side"/>
+            <wp:docPr id="1" name="ls2" descr="A triangle marked with two angles, the side joining them, and an unknown side. Plotted data: Triangle ABC, drawn to scale, with A at the bottom left, B at the bottom right, and C at the top. Angle A is marked 35°. Angle B is marked 80°. Side c, the bottom side, is marked 14. Side a, from B to C, is marked with a question mark. Side b is labeled with a letter only." title="A triangle marked with two angles, the side joining them, and an unknown side"/>
             <wp:cNvGraphicFramePr>
               <a:graphicFrameLocks xmlns:a="http://schemas.openxmlformats.org/drawingml/2006/main" noChangeAspect="1"/>
             </wp:cNvGraphicFramePr>
@@ -3056,7 +3056,7 @@
           <w:sz w:val="22"/>
           <w:szCs w:val="22"/>
         </w:rPr>
-        <w:t xml:space="preserve">Triangle ABC, not drawn to scale, with A at the bottom left, B at the bottom right, and C at the top. Angle A is marked 35°. Angle B is marked 80°. Side c, the bottom side, is marked 14. Side a, from B to C, is marked with a question mark.</w:t>
+        <w:t xml:space="preserve">Triangle ABC, drawn to scale, with A at the bottom left, B at the bottom right, and C at the top. Angle A is marked 35°. Angle B is marked 80°. Side c, the bottom side, is marked 14. Side a, from B to C, is marked with a question mark. Side b is labeled with a letter only.</w:t>
       </w:r>
     </w:p>
     <w:p>
@@ -3438,7 +3438,7 @@
           <wp:inline distT="0" distB="0" distL="0" distR="0">
             <wp:extent cx="4429125" cy="2476500"/>
             <wp:effectExtent t="0" r="0" b="0" l="0"/>
-            <wp:docPr id="1" name="ls3" descr="A triangle with a wide angle at C, one marked side, and an unknown side. Plotted data: Triangle ABC, not drawn to scale, with A at the bottom left, B at the bottom right, and C at the top, where the angle opens wide. Angle A is marked 25°. Angle C is marked 105°. Side b, from A to C, is marked 9. Side a, from B to C, is marked with a question mark." title="A triangle with a wide angle at C, one marked side, and an unknown side"/>
+            <wp:docPr id="1" name="ls3" descr="A triangle marked with two angles, one side, and an unknown side. Plotted data: Triangle ABC, drawn to scale, with A at the bottom left, B at the bottom right, and C at the top. Angle A is marked 25°. Angle C is marked 105°. Side b, from A to C, is marked 9. Side a, from B to C, is marked with a question mark. Side c is labeled with a letter only." title="A triangle marked with two angles, one side, and an unknown side"/>
             <wp:cNvGraphicFramePr>
               <a:graphicFrameLocks xmlns:a="http://schemas.openxmlformats.org/drawingml/2006/main" noChangeAspect="1"/>
             </wp:cNvGraphicFramePr>
@@ -3492,7 +3492,7 @@
           <w:sz w:val="22"/>
           <w:szCs w:val="22"/>
         </w:rPr>
-        <w:t xml:space="preserve">Triangle ABC, not drawn to scale, with A at the bottom left, B at the bottom right, and C at the top, where the angle opens wide. Angle A is marked 25°. Angle C is marked 105°. Side b, from A to C, is marked 9. Side a, from B to C, is marked with a question mark.</w:t>
+        <w:t xml:space="preserve">Triangle ABC, drawn to scale, with A at the bottom left, B at the bottom right, and C at the top. Angle A is marked 25°. Angle C is marked 105°. Side b, from A to C, is marked 9. Side a, from B to C, is marked with a question mark. Side c is labeled with a letter only.</w:t>
       </w:r>
     </w:p>
     <w:p>
@@ -3853,7 +3853,7 @@
           <wp:inline distT="0" distB="0" distL="0" distR="0">
             <wp:extent cx="4429125" cy="2476500"/>
             <wp:effectExtent t="0" r="0" b="0" l="0"/>
-            <wp:docPr id="1" name="ls4" descr="A triangle marked with angle A, two sides, and an unknown angle at B. Plotted data: Triangle ABC, not drawn to scale, with A at the bottom left, B at the bottom right, and C at the top. Angle A is marked 50°. Side a, from B to C, is marked 12. Side b, from A to C, is marked 9. Angle B is marked with a question mark." title="A triangle marked with angle A, two sides, and an unknown angle at B"/>
+            <wp:docPr id="1" name="ls4" descr="A triangle marked with angle A, two sides, and an unknown angle at B. Plotted data: Triangle ABC, drawn to scale, with A at the bottom left, B at the bottom right, and C at the top. Angle A is marked 50°. Side a, from B to C, is marked 12. Side b, from A to C, is marked 9. Angle B is marked with a question mark. Side c is labeled with a letter only." title="A triangle marked with angle A, two sides, and an unknown angle at B"/>
             <wp:cNvGraphicFramePr>
               <a:graphicFrameLocks xmlns:a="http://schemas.openxmlformats.org/drawingml/2006/main" noChangeAspect="1"/>
             </wp:cNvGraphicFramePr>
@@ -3907,7 +3907,7 @@
           <w:sz w:val="22"/>
           <w:szCs w:val="22"/>
         </w:rPr>
-        <w:t xml:space="preserve">Triangle ABC, not drawn to scale, with A at the bottom left, B at the bottom right, and C at the top. Angle A is marked 50°. Side a, from B to C, is marked 12. Side b, from A to C, is marked 9. Angle B is marked with a question mark.</w:t>
+        <w:t xml:space="preserve">Triangle ABC, drawn to scale, with A at the bottom left, B at the bottom right, and C at the top. Angle A is marked 50°. Side a, from B to C, is marked 12. Side b, from A to C, is marked 9. Angle B is marked with a question mark. Side c is labeled with a letter only.</w:t>
       </w:r>
     </w:p>
     <w:p>
@@ -4280,7 +4280,7 @@
           <wp:inline distT="0" distB="0" distL="0" distR="0">
             <wp:extent cx="4429125" cy="2476500"/>
             <wp:effectExtent t="0" r="0" b="0" l="0"/>
-            <wp:docPr id="1" name="am1" descr="Angle A with side b drawn to C and a dashed height from C to the bottom line. Plotted data: Angle A, at the bottom left, is marked 30°, with a long bottom line running to the right. Side b runs from A up to point C and is marked 10. A dashed line labeled h drops straight down from C and meets the bottom line at a right angle. A note says side a = 6 must reach the bottom line from C. Side a itself is not drawn." title="Angle A with side b drawn to C and a dashed height from C to the bottom line"/>
+            <wp:docPr id="1" name="am1" descr="Angle A with side b drawn to C and a dashed height from C to the bottom line. Plotted data: Not drawn to scale. Angle A, at the bottom left, is marked 30°, with a long bottom line running to the right. Side b runs from A up to point C and is marked 10. A dashed line labeled h drops straight down from C and meets the bottom line at a right angle. A note says side a = 6 must reach the bottom line from C. Side a itself is not drawn." title="Angle A with side b drawn to C and a dashed height from C to the bottom line"/>
             <wp:cNvGraphicFramePr>
               <a:graphicFrameLocks xmlns:a="http://schemas.openxmlformats.org/drawingml/2006/main" noChangeAspect="1"/>
             </wp:cNvGraphicFramePr>
@@ -4334,7 +4334,7 @@
           <w:sz w:val="22"/>
           <w:szCs w:val="22"/>
         </w:rPr>
-        <w:t xml:space="preserve">Angle A, at the bottom left, is marked 30°, with a long bottom line running to the right. Side b runs from A up to point C and is marked 10. A dashed line labeled h drops straight down from C and meets the bottom line at a right angle. A note says side a = 6 must reach the bottom line from C. Side a itself is not drawn.</w:t>
+        <w:t xml:space="preserve">Not drawn to scale. Angle A, at the bottom left, is marked 30°, with a long bottom line running to the right. Side b runs from A up to point C and is marked 10. A dashed line labeled h drops straight down from C and meets the bottom line at a right angle. A note says side a = 6 must reach the bottom line from C. Side a itself is not drawn.</w:t>
       </w:r>
     </w:p>
     <w:p>
@@ -4549,7 +4549,7 @@
           <wp:inline distT="0" distB="0" distL="0" distR="0">
             <wp:extent cx="4429125" cy="2476500"/>
             <wp:effectExtent t="0" r="0" b="0" l="0"/>
-            <wp:docPr id="1" name="am2" descr="Angle A with side b drawn to C and a dashed height from C to the bottom line. Plotted data: Angle A, at the bottom left, is marked 35°, with a long bottom line running to the right. Side b runs from A up to point C and is marked 8. A dashed line labeled h drops straight down from C and meets the bottom line at a right angle. A note says side a = 12 must reach the bottom line from C. Side a itself is not drawn." title="Angle A with side b drawn to C and a dashed height from C to the bottom line"/>
+            <wp:docPr id="1" name="am2" descr="Angle A with side b drawn to C and a dashed height from C to the bottom line. Plotted data: Not drawn to scale. Angle A, at the bottom left, is marked 35°, with a long bottom line running to the right. Side b runs from A up to point C and is marked 8. A dashed line labeled h drops straight down from C and meets the bottom line at a right angle. A note says side a = 12 must reach the bottom line from C. Side a itself is not drawn." title="Angle A with side b drawn to C and a dashed height from C to the bottom line"/>
             <wp:cNvGraphicFramePr>
               <a:graphicFrameLocks xmlns:a="http://schemas.openxmlformats.org/drawingml/2006/main" noChangeAspect="1"/>
             </wp:cNvGraphicFramePr>
@@ -4603,7 +4603,7 @@
           <w:sz w:val="22"/>
           <w:szCs w:val="22"/>
         </w:rPr>
-        <w:t xml:space="preserve">Angle A, at the bottom left, is marked 35°, with a long bottom line running to the right. Side b runs from A up to point C and is marked 8. A dashed line labeled h drops straight down from C and meets the bottom line at a right angle. A note says side a = 12 must reach the bottom line from C. Side a itself is not drawn.</w:t>
+        <w:t xml:space="preserve">Not drawn to scale. Angle A, at the bottom left, is marked 35°, with a long bottom line running to the right. Side b runs from A up to point C and is marked 8. A dashed line labeled h drops straight down from C and meets the bottom line at a right angle. A note says side a = 12 must reach the bottom line from C. Side a itself is not drawn.</w:t>
       </w:r>
     </w:p>
     <w:p>
@@ -4856,9 +4856,9 @@
       <w:r>
         <w:drawing>
           <wp:inline distT="0" distB="0" distL="0" distR="0">
-            <wp:extent cx="4410075" cy="2476500"/>
+            <wp:extent cx="4429125" cy="2476500"/>
             <wp:effectExtent t="0" r="0" b="0" l="0"/>
-            <wp:docPr id="1" name="am3" descr="Side a swinging from C to two points on the bottom line. Plotted data: Not drawn to scale. Angle A, at the bottom left, is marked 30°, and side b = 10 runs from A up to C. From C, side a = 6 is drawn to two points on the bottom line: B1, farther from A (solid line), and B2, closer to A (dashed line). A dashed arc centered at C passes through both points." title="Side a swinging from C to two points on the bottom line"/>
+            <wp:docPr id="1" name="am3" descr="Side a swinging from C to two points on the bottom line. Plotted data: Drawn to scale. Angle A, at the bottom left, is marked 40°, and side b = 12 runs from A up to C. From C, side a = 9 is drawn to two points on the bottom line: B1, farther from A (solid line), and B2, closer to A (dashed line). A dashed arc centered at C passes through both points." title="Side a swinging from C to two points on the bottom line"/>
             <wp:cNvGraphicFramePr>
               <a:graphicFrameLocks xmlns:a="http://schemas.openxmlformats.org/drawingml/2006/main" noChangeAspect="1"/>
             </wp:cNvGraphicFramePr>
@@ -4881,7 +4881,7 @@
                   <pic:spPr bwMode="auto">
                     <a:xfrm>
                       <a:off x="0" y="0"/>
-                      <a:ext cx="4410075" cy="2476500"/>
+                      <a:ext cx="4429125" cy="2476500"/>
                     </a:xfrm>
                     <a:prstGeom prst="rect">
                       <a:avLst/>
@@ -4912,7 +4912,7 @@
           <w:sz w:val="22"/>
           <w:szCs w:val="22"/>
         </w:rPr>
-        <w:t xml:space="preserve">Not drawn to scale. Angle A, at the bottom left, is marked 30°, and side b = 10 runs from A up to C. From C, side a = 6 is drawn to two points on the bottom line: B1, farther from A (solid line), and B2, closer to A (dashed line). A dashed arc centered at C passes through both points.</w:t>
+        <w:t xml:space="preserve">Drawn to scale. Angle A, at the bottom left, is marked 40°, and side b = 12 runs from A up to C. From C, side a = 9 is drawn to two points on the bottom line: B1, farther from A (solid line), and B2, closer to A (dashed line). A dashed arc centered at C passes through both points.</w:t>
       </w:r>
     </w:p>
     <w:p>
@@ -4927,26 +4927,26 @@
           <w:sz w:val="40"/>
           <w:szCs w:val="40"/>
         </w:rPr>
-        <w:t xml:space="preserve">A=30</w:t>
-      </w:r>
-      <w:r>
-        <w:rPr>
-          <w:i/>
-          <w:iCs/>
-          <w:sz w:val="40"/>
-          <w:szCs w:val="40"/>
-          <w:vertAlign w:val="superscript"/>
-        </w:rPr>
-        <w:t xml:space="preserve">°</w:t>
-      </w:r>
-      <w:r>
-        <w:rPr>
-          <w:i/>
-          <w:iCs/>
-          <w:sz w:val="40"/>
-          <w:szCs w:val="40"/>
-        </w:rPr>
-        <w:t xml:space="preserve">,    b=10,    a=6</w:t>
+        <w:t xml:space="preserve">A=40</w:t>
+      </w:r>
+      <w:r>
+        <w:rPr>
+          <w:i/>
+          <w:iCs/>
+          <w:sz w:val="40"/>
+          <w:szCs w:val="40"/>
+          <w:vertAlign w:val="superscript"/>
+        </w:rPr>
+        <w:t xml:space="preserve">°</w:t>
+      </w:r>
+      <w:r>
+        <w:rPr>
+          <w:i/>
+          <w:iCs/>
+          <w:sz w:val="40"/>
+          <w:szCs w:val="40"/>
+        </w:rPr>
+        <w:t xml:space="preserve">,    b=12,    a=9</w:t>
       </w:r>
     </w:p>
     <w:p>
@@ -4963,7 +4963,17 @@
         <w:spacing w:after="120" w:before="80" w:line="300"/>
       </w:pPr>
       <w:r>
-        <w:t xml:space="preserve">Both triangles fit. What are the two possible values of angle </w:t>
+        <w:t xml:space="preserve">Side </w:t>
+      </w:r>
+      <w:r>
+        <w:rPr>
+          <w:i/>
+          <w:iCs/>
+        </w:rPr>
+        <w:t xml:space="preserve">a</w:t>
+      </w:r>
+      <w:r>
+        <w:t xml:space="preserve"> can land in two places, as the figure shows. What are the two possible values of angle </w:t>
       </w:r>
       <w:r>
         <w:rPr>
@@ -4989,7 +4999,7 @@
         <w:t xml:space="preserve">A.  </w:t>
       </w:r>
       <w:r>
-        <w:t xml:space="preserve">about 56.4° only</w:t>
+        <w:t xml:space="preserve">about 59.0° only</w:t>
       </w:r>
     </w:p>
     <w:p>
@@ -5005,7 +5015,7 @@
         <w:t xml:space="preserve">B.  </w:t>
       </w:r>
       <w:r>
-        <w:t xml:space="preserve">about 33.6° and about 146.4°</w:t>
+        <w:t xml:space="preserve">about 31.0° and about 149.0°</w:t>
       </w:r>
     </w:p>
     <w:p>
@@ -5021,7 +5031,7 @@
         <w:t xml:space="preserve">C.  </w:t>
       </w:r>
       <w:r>
-        <w:t xml:space="preserve">about 56.4° and about 123.6°</w:t>
+        <w:t xml:space="preserve">about 59.0° and about 121.0°</w:t>
       </w:r>
     </w:p>
     <w:p>
@@ -5037,7 +5047,7 @@
         <w:t xml:space="preserve">D.  </w:t>
       </w:r>
       <w:r>
-        <w:t xml:space="preserve">about 56.4° and about 93.6°</w:t>
+        <w:t xml:space="preserve">about 59.0° and about 81.0°</w:t>
       </w:r>
     </w:p>
     <w:p>
@@ -5064,7 +5074,7 @@
           <w:i/>
           <w:iCs/>
         </w:rPr>
-        <w:t xml:space="preserve"> B=(10</w:t>
+        <w:t xml:space="preserve"> B=(12</w:t>
       </w:r>
       <w:r>
         <w:t xml:space="preserve">sin</w:t>
@@ -5074,22 +5084,22 @@
           <w:i/>
           <w:iCs/>
         </w:rPr>
-        <w:t xml:space="preserve"> 30</w:t>
-      </w:r>
-      <w:r>
-        <w:rPr>
-          <w:i/>
-          <w:iCs/>
-          <w:vertAlign w:val="superscript"/>
-        </w:rPr>
-        <w:t xml:space="preserve">°</w:t>
-      </w:r>
-      <w:r>
-        <w:rPr>
-          <w:i/>
-          <w:iCs/>
-        </w:rPr>
-        <w:t xml:space="preserve">)/6≈ 0.833</w:t>
+        <w:t xml:space="preserve"> 40</w:t>
+      </w:r>
+      <w:r>
+        <w:rPr>
+          <w:i/>
+          <w:iCs/>
+          <w:vertAlign w:val="superscript"/>
+        </w:rPr>
+        <w:t xml:space="preserve">°</w:t>
+      </w:r>
+      <w:r>
+        <w:rPr>
+          <w:i/>
+          <w:iCs/>
+        </w:rPr>
+        <w:t xml:space="preserve">)/9≈ 0.857</w:t>
       </w:r>
       <w:r>
         <w:t xml:space="preserve">, so </w:t>
@@ -5099,7 +5109,7 @@
           <w:i/>
           <w:iCs/>
         </w:rPr>
-        <w:t xml:space="preserve">B≈ 56.4</w:t>
+        <w:t xml:space="preserve">B≈ 59.0</w:t>
       </w:r>
       <w:r>
         <w:rPr>
@@ -5150,22 +5160,22 @@
           <w:i/>
           <w:iCs/>
         </w:rPr>
-        <w:t xml:space="preserve">−56.4</w:t>
-      </w:r>
-      <w:r>
-        <w:rPr>
-          <w:i/>
-          <w:iCs/>
-          <w:vertAlign w:val="superscript"/>
-        </w:rPr>
-        <w:t xml:space="preserve">°</w:t>
-      </w:r>
-      <w:r>
-        <w:rPr>
-          <w:i/>
-          <w:iCs/>
-        </w:rPr>
-        <w:t xml:space="preserve">=123.6</w:t>
+        <w:t xml:space="preserve">−59.0</w:t>
+      </w:r>
+      <w:r>
+        <w:rPr>
+          <w:i/>
+          <w:iCs/>
+          <w:vertAlign w:val="superscript"/>
+        </w:rPr>
+        <w:t xml:space="preserve">°</w:t>
+      </w:r>
+      <w:r>
+        <w:rPr>
+          <w:i/>
+          <w:iCs/>
+        </w:rPr>
+        <w:t xml:space="preserve">=121.0</w:t>
       </w:r>
       <w:r>
         <w:rPr>
@@ -5201,33 +5211,66 @@
           <w:i/>
           <w:iCs/>
         </w:rPr>
-        <w:t xml:space="preserve">30</w:t>
-      </w:r>
-      <w:r>
-        <w:rPr>
-          <w:i/>
-          <w:iCs/>
-          <w:vertAlign w:val="superscript"/>
-        </w:rPr>
-        <w:t xml:space="preserve">°</w:t>
-      </w:r>
-      <w:r>
-        <w:rPr>
-          <w:i/>
-          <w:iCs/>
-        </w:rPr>
-        <w:t xml:space="preserve">+123.6</w:t>
-      </w:r>
-      <w:r>
-        <w:rPr>
-          <w:i/>
-          <w:iCs/>
-          <w:vertAlign w:val="superscript"/>
-        </w:rPr>
-        <w:t xml:space="preserve">°</w:t>
-      </w:r>
-      <w:r>
-        <w:t xml:space="preserve"> is under 180°. The value 93.6° is angle </w:t>
+        <w:t xml:space="preserve">40</w:t>
+      </w:r>
+      <w:r>
+        <w:rPr>
+          <w:i/>
+          <w:iCs/>
+          <w:vertAlign w:val="superscript"/>
+        </w:rPr>
+        <w:t xml:space="preserve">°</w:t>
+      </w:r>
+      <w:r>
+        <w:rPr>
+          <w:i/>
+          <w:iCs/>
+        </w:rPr>
+        <w:t xml:space="preserve">+121.0</w:t>
+      </w:r>
+      <w:r>
+        <w:rPr>
+          <w:i/>
+          <w:iCs/>
+          <w:vertAlign w:val="superscript"/>
+        </w:rPr>
+        <w:t xml:space="preserve">°</w:t>
+      </w:r>
+      <w:r>
+        <w:t xml:space="preserve"> is under 180°. The pair 31.0° and 149.0° starts from </w:t>
+      </w:r>
+      <w:r>
+        <w:rPr>
+          <w:i/>
+          <w:iCs/>
+        </w:rPr>
+        <w:t xml:space="preserve">90</w:t>
+      </w:r>
+      <w:r>
+        <w:rPr>
+          <w:i/>
+          <w:iCs/>
+          <w:vertAlign w:val="superscript"/>
+        </w:rPr>
+        <w:t xml:space="preserve">°</w:t>
+      </w:r>
+      <w:r>
+        <w:rPr>
+          <w:i/>
+          <w:iCs/>
+        </w:rPr>
+        <w:t xml:space="preserve">−59.0</w:t>
+      </w:r>
+      <w:r>
+        <w:rPr>
+          <w:i/>
+          <w:iCs/>
+          <w:vertAlign w:val="superscript"/>
+        </w:rPr>
+        <w:t xml:space="preserve">°</w:t>
+      </w:r>
+      <w:r>
+        <w:t xml:space="preserve">, which is not what the sine gives. The value 81.0° is angle </w:t>
       </w:r>
       <w:r>
         <w:rPr>
@@ -5256,7 +5299,7 @@
           <w:i/>
           <w:iCs/>
         </w:rPr>
-        <w:t xml:space="preserve">B≈ 56.4</w:t>
+        <w:t xml:space="preserve">B≈ 59.0</w:t>
       </w:r>
       <w:r>
         <w:rPr>
@@ -5282,7 +5325,7 @@
           <w:i/>
           <w:iCs/>
         </w:rPr>
-        <w:t xml:space="preserve">B≈ 123.6</w:t>
+        <w:t xml:space="preserve">B≈ 121.0</w:t>
       </w:r>
       <w:r>
         <w:rPr>
@@ -5320,7 +5363,7 @@
           <wp:inline distT="0" distB="0" distL="0" distR="0">
             <wp:extent cx="4429125" cy="2476500"/>
             <wp:effectExtent t="0" r="0" b="0" l="0"/>
-            <wp:docPr id="1" name="am4" descr="Side a swinging from C to two points on the bottom line. Plotted data: Not drawn to scale. Angle A, at the bottom left, is marked 30°, and side b = 10 runs from A up to C. From C, side a = 6 is drawn to two points on the bottom line: B1, farther from A (solid line), and B2, closer to A (dashed line). A dashed arc centered at C passes through both points." title="Side a swinging from C to two points on the bottom line"/>
+            <wp:docPr id="1" name="am4" descr="Side a swinging from C to two points on the bottom line. Plotted data: Drawn to scale. Angle A, at the bottom left, is marked 40°, and side b = 12 runs from A up to C. From C, side a = 9 is drawn to two points on the bottom line: B1, farther from A (solid line), and B2, closer to A (dashed line). A dashed arc centered at C passes through both points." title="Side a swinging from C to two points on the bottom line"/>
             <wp:cNvGraphicFramePr>
               <a:graphicFrameLocks xmlns:a="http://schemas.openxmlformats.org/drawingml/2006/main" noChangeAspect="1"/>
             </wp:cNvGraphicFramePr>
@@ -5374,7 +5417,7 @@
           <w:sz w:val="22"/>
           <w:szCs w:val="22"/>
         </w:rPr>
-        <w:t xml:space="preserve">Not drawn to scale. Angle A, at the bottom left, is marked 30°, and side b = 10 runs from A up to C. From C, side a = 6 is drawn to two points on the bottom line: B1, farther from A (solid line), and B2, closer to A (dashed line). A dashed arc centered at C passes through both points.</w:t>
+        <w:t xml:space="preserve">Drawn to scale. Angle A, at the bottom left, is marked 40°, and side b = 12 runs from A up to C. From C, side a = 9 is drawn to two points on the bottom line: B1, farther from A (solid line), and B2, closer to A (dashed line). A dashed arc centered at C passes through both points.</w:t>
       </w:r>
     </w:p>
     <w:p>
@@ -5389,26 +5432,26 @@
           <w:sz w:val="40"/>
           <w:szCs w:val="40"/>
         </w:rPr>
-        <w:t xml:space="preserve">A=30</w:t>
-      </w:r>
-      <w:r>
-        <w:rPr>
-          <w:i/>
-          <w:iCs/>
-          <w:sz w:val="40"/>
-          <w:szCs w:val="40"/>
-          <w:vertAlign w:val="superscript"/>
-        </w:rPr>
-        <w:t xml:space="preserve">°</w:t>
-      </w:r>
-      <w:r>
-        <w:rPr>
-          <w:i/>
-          <w:iCs/>
-          <w:sz w:val="40"/>
-          <w:szCs w:val="40"/>
-        </w:rPr>
-        <w:t xml:space="preserve">,    b=10,    a=6</w:t>
+        <w:t xml:space="preserve">A=40</w:t>
+      </w:r>
+      <w:r>
+        <w:rPr>
+          <w:i/>
+          <w:iCs/>
+          <w:sz w:val="40"/>
+          <w:szCs w:val="40"/>
+          <w:vertAlign w:val="superscript"/>
+        </w:rPr>
+        <w:t xml:space="preserve">°</w:t>
+      </w:r>
+      <w:r>
+        <w:rPr>
+          <w:i/>
+          <w:iCs/>
+          <w:sz w:val="40"/>
+          <w:szCs w:val="40"/>
+        </w:rPr>
+        <w:t xml:space="preserve">,    b=12,    a=9</w:t>
       </w:r>
     </w:p>
     <w:p>
@@ -5425,43 +5468,7 @@
         <w:spacing w:after="120" w:before="80" w:line="300"/>
       </w:pPr>
       <w:r>
-        <w:t xml:space="preserve">Using </w:t>
-      </w:r>
-      <w:r>
-        <w:rPr>
-          <w:i/>
-          <w:iCs/>
-        </w:rPr>
-        <w:t xml:space="preserve">B≈ 56.4</w:t>
-      </w:r>
-      <w:r>
-        <w:rPr>
-          <w:i/>
-          <w:iCs/>
-          <w:vertAlign w:val="superscript"/>
-        </w:rPr>
-        <w:t xml:space="preserve">°</w:t>
-      </w:r>
-      <w:r>
-        <w:t xml:space="preserve"> or </w:t>
-      </w:r>
-      <w:r>
-        <w:rPr>
-          <w:i/>
-          <w:iCs/>
-        </w:rPr>
-        <w:t xml:space="preserve">B≈ 123.6</w:t>
-      </w:r>
-      <w:r>
-        <w:rPr>
-          <w:i/>
-          <w:iCs/>
-          <w:vertAlign w:val="superscript"/>
-        </w:rPr>
-        <w:t xml:space="preserve">°</w:t>
-      </w:r>
-      <w:r>
-        <w:t xml:space="preserve">, what are the two possible lengths of side </w:t>
+        <w:t xml:space="preserve">These are the same two triangles as in Swing 1. What are the two possible lengths of side </w:t>
       </w:r>
       <w:r>
         <w:rPr>
@@ -5487,7 +5494,7 @@
         <w:t xml:space="preserve">A.  </w:t>
       </w:r>
       <w:r>
-        <w:t xml:space="preserve">about 12.0 only</w:t>
+        <w:t xml:space="preserve">about 13.8 only</w:t>
       </w:r>
     </w:p>
     <w:p>
@@ -5503,7 +5510,7 @@
         <w:t xml:space="preserve">B.  </w:t>
       </w:r>
       <w:r>
-        <w:t xml:space="preserve">about 5.3 only</w:t>
+        <w:t xml:space="preserve">about 4.6 only</w:t>
       </w:r>
     </w:p>
     <w:p>
@@ -5519,7 +5526,7 @@
         <w:t xml:space="preserve">C.  </w:t>
       </w:r>
       <w:r>
-        <w:t xml:space="preserve">about 8.0 and about 12.0</w:t>
+        <w:t xml:space="preserve">about 7.9 and about 13.8</w:t>
       </w:r>
     </w:p>
     <w:p>
@@ -5535,7 +5542,7 @@
         <w:t xml:space="preserve">D.  </w:t>
       </w:r>
       <w:r>
-        <w:t xml:space="preserve">about 12.0 and about 5.3</w:t>
+        <w:t xml:space="preserve">about 13.8 and about 4.6</w:t>
       </w:r>
     </w:p>
     <w:p>
@@ -5552,7 +5559,43 @@
         <w:spacing w:after="120" w:before="80" w:line="300"/>
       </w:pPr>
       <w:r>
-        <w:t xml:space="preserve">Find </w:t>
+        <w:t xml:space="preserve">With </w:t>
+      </w:r>
+      <w:r>
+        <w:rPr>
+          <w:i/>
+          <w:iCs/>
+        </w:rPr>
+        <w:t xml:space="preserve">B≈ 59.0</w:t>
+      </w:r>
+      <w:r>
+        <w:rPr>
+          <w:i/>
+          <w:iCs/>
+          <w:vertAlign w:val="superscript"/>
+        </w:rPr>
+        <w:t xml:space="preserve">°</w:t>
+      </w:r>
+      <w:r>
+        <w:t xml:space="preserve"> or </w:t>
+      </w:r>
+      <w:r>
+        <w:rPr>
+          <w:i/>
+          <w:iCs/>
+        </w:rPr>
+        <w:t xml:space="preserve">B≈ 121.0</w:t>
+      </w:r>
+      <w:r>
+        <w:rPr>
+          <w:i/>
+          <w:iCs/>
+          <w:vertAlign w:val="superscript"/>
+        </w:rPr>
+        <w:t xml:space="preserve">°</w:t>
+      </w:r>
+      <w:r>
+        <w:t xml:space="preserve">, find </w:t>
       </w:r>
       <w:r>
         <w:rPr>
@@ -5584,37 +5627,37 @@
           <w:i/>
           <w:iCs/>
         </w:rPr>
-        <w:t xml:space="preserve">−30</w:t>
-      </w:r>
-      <w:r>
-        <w:rPr>
-          <w:i/>
-          <w:iCs/>
-          <w:vertAlign w:val="superscript"/>
-        </w:rPr>
-        <w:t xml:space="preserve">°</w:t>
-      </w:r>
-      <w:r>
-        <w:rPr>
-          <w:i/>
-          <w:iCs/>
-        </w:rPr>
-        <w:t xml:space="preserve">−56.4</w:t>
-      </w:r>
-      <w:r>
-        <w:rPr>
-          <w:i/>
-          <w:iCs/>
-          <w:vertAlign w:val="superscript"/>
-        </w:rPr>
-        <w:t xml:space="preserve">°</w:t>
-      </w:r>
-      <w:r>
-        <w:rPr>
-          <w:i/>
-          <w:iCs/>
-        </w:rPr>
-        <w:t xml:space="preserve">=93.6</w:t>
+        <w:t xml:space="preserve">−40</w:t>
+      </w:r>
+      <w:r>
+        <w:rPr>
+          <w:i/>
+          <w:iCs/>
+          <w:vertAlign w:val="superscript"/>
+        </w:rPr>
+        <w:t xml:space="preserve">°</w:t>
+      </w:r>
+      <w:r>
+        <w:rPr>
+          <w:i/>
+          <w:iCs/>
+        </w:rPr>
+        <w:t xml:space="preserve">−59.0</w:t>
+      </w:r>
+      <w:r>
+        <w:rPr>
+          <w:i/>
+          <w:iCs/>
+          <w:vertAlign w:val="superscript"/>
+        </w:rPr>
+        <w:t xml:space="preserve">°</w:t>
+      </w:r>
+      <w:r>
+        <w:rPr>
+          <w:i/>
+          <w:iCs/>
+        </w:rPr>
+        <w:t xml:space="preserve">=81.0</w:t>
       </w:r>
       <w:r>
         <w:rPr>
@@ -5647,37 +5690,37 @@
           <w:i/>
           <w:iCs/>
         </w:rPr>
-        <w:t xml:space="preserve">−30</w:t>
-      </w:r>
-      <w:r>
-        <w:rPr>
-          <w:i/>
-          <w:iCs/>
-          <w:vertAlign w:val="superscript"/>
-        </w:rPr>
-        <w:t xml:space="preserve">°</w:t>
-      </w:r>
-      <w:r>
-        <w:rPr>
-          <w:i/>
-          <w:iCs/>
-        </w:rPr>
-        <w:t xml:space="preserve">−123.6</w:t>
-      </w:r>
-      <w:r>
-        <w:rPr>
-          <w:i/>
-          <w:iCs/>
-          <w:vertAlign w:val="superscript"/>
-        </w:rPr>
-        <w:t xml:space="preserve">°</w:t>
-      </w:r>
-      <w:r>
-        <w:rPr>
-          <w:i/>
-          <w:iCs/>
-        </w:rPr>
-        <w:t xml:space="preserve">=26.4</w:t>
+        <w:t xml:space="preserve">−40</w:t>
+      </w:r>
+      <w:r>
+        <w:rPr>
+          <w:i/>
+          <w:iCs/>
+          <w:vertAlign w:val="superscript"/>
+        </w:rPr>
+        <w:t xml:space="preserve">°</w:t>
+      </w:r>
+      <w:r>
+        <w:rPr>
+          <w:i/>
+          <w:iCs/>
+        </w:rPr>
+        <w:t xml:space="preserve">−121.0</w:t>
+      </w:r>
+      <w:r>
+        <w:rPr>
+          <w:i/>
+          <w:iCs/>
+          <w:vertAlign w:val="superscript"/>
+        </w:rPr>
+        <w:t xml:space="preserve">°</w:t>
+      </w:r>
+      <w:r>
+        <w:rPr>
+          <w:i/>
+          <w:iCs/>
+        </w:rPr>
+        <w:t xml:space="preserve">=19.0</w:t>
       </w:r>
       <w:r>
         <w:rPr>
@@ -5695,7 +5738,7 @@
           <w:i/>
           <w:iCs/>
         </w:rPr>
-        <w:t xml:space="preserve">c=(6</w:t>
+        <w:t xml:space="preserve">c=(9</w:t>
       </w:r>
       <w:r>
         <w:t xml:space="preserve">sin</w:t>
@@ -5715,7 +5758,7 @@
           <w:i/>
           <w:iCs/>
         </w:rPr>
-        <w:t xml:space="preserve"> 30</w:t>
+        <w:t xml:space="preserve"> 40</w:t>
       </w:r>
       <w:r>
         <w:rPr>
@@ -5733,16 +5776,80 @@
         <w:t xml:space="preserve">)</w:t>
       </w:r>
       <w:r>
-        <w:t xml:space="preserve">: about 12.0 in the first triangle and about 5.3 in the second. The answer 8.0 treats the triangle as a right triangle. </w:t>
-      </w:r>
-      <w:r>
-        <w:rPr>
-          <w:b/>
-          <w:bCs/>
-          <w:i/>
-          <w:iCs/>
-        </w:rPr>
-        <w:t xml:space="preserve">c≈ 12.0</w:t>
+        <w:t xml:space="preserve">: about 13.8 at </w:t>
+      </w:r>
+      <w:r>
+        <w:rPr>
+          <w:i/>
+          <w:iCs/>
+        </w:rPr>
+        <w:t xml:space="preserve">B</w:t>
+      </w:r>
+      <w:r>
+        <w:rPr>
+          <w:i/>
+          <w:iCs/>
+          <w:vertAlign w:val="subscript"/>
+        </w:rPr>
+        <w:t xml:space="preserve">1</w:t>
+      </w:r>
+      <w:r>
+        <w:t xml:space="preserve"> and about 4.6 at </w:t>
+      </w:r>
+      <w:r>
+        <w:rPr>
+          <w:i/>
+          <w:iCs/>
+        </w:rPr>
+        <w:t xml:space="preserve">B</w:t>
+      </w:r>
+      <w:r>
+        <w:rPr>
+          <w:i/>
+          <w:iCs/>
+          <w:vertAlign w:val="subscript"/>
+        </w:rPr>
+        <w:t xml:space="preserve">2</w:t>
+      </w:r>
+      <w:r>
+        <w:t xml:space="preserve">. The figure agrees: </w:t>
+      </w:r>
+      <w:r>
+        <w:rPr>
+          <w:i/>
+          <w:iCs/>
+        </w:rPr>
+        <w:t xml:space="preserve">B</w:t>
+      </w:r>
+      <w:r>
+        <w:rPr>
+          <w:i/>
+          <w:iCs/>
+          <w:vertAlign w:val="subscript"/>
+        </w:rPr>
+        <w:t xml:space="preserve">2</w:t>
+      </w:r>
+      <w:r>
+        <w:t xml:space="preserve"> is much closer to </w:t>
+      </w:r>
+      <w:r>
+        <w:rPr>
+          <w:i/>
+          <w:iCs/>
+        </w:rPr>
+        <w:t xml:space="preserve">A</w:t>
+      </w:r>
+      <w:r>
+        <w:t xml:space="preserve">. The answer 7.9 treats the triangle as a right triangle. </w:t>
+      </w:r>
+      <w:r>
+        <w:rPr>
+          <w:b/>
+          <w:bCs/>
+          <w:i/>
+          <w:iCs/>
+        </w:rPr>
+        <w:t xml:space="preserve">c≈ 13.8</w:t>
       </w:r>
       <w:r>
         <w:rPr>
@@ -5758,7 +5865,7 @@
           <w:i/>
           <w:iCs/>
         </w:rPr>
-        <w:t xml:space="preserve">c≈ 5.3</w:t>
+        <w:t xml:space="preserve">c≈ 4.6</w:t>
       </w:r>
       <w:r>
         <w:rPr>
@@ -5974,7 +6081,7 @@
         <w:t xml:space="preserve">A.  </w:t>
       </w:r>
       <w:r>
-        <w:t xml:space="preserve">The minus should be a plus, giving about 17.3.</w:t>
+        <w:t xml:space="preserve">The minus should be a plus, giving about 15.5.</w:t>
       </w:r>
     </w:p>
     <w:p>
@@ -6022,7 +6129,7 @@
         <w:t xml:space="preserve">D.  </w:t>
       </w:r>
       <w:r>
-        <w:t xml:space="preserve">The calculator should be in radians: about 3.9.</w:t>
+        <w:t xml:space="preserve">The calculator should be in radians: about 10.0.</w:t>
       </w:r>
     </w:p>
     <w:p>

</xml_diff>